<commit_message>
Baseline Resume and LinkedIn Changes
</commit_message>
<xml_diff>
--- a/LinkedIn/LinkedIn Changes - Dot Pointed.docx
+++ b/LinkedIn/LinkedIn Changes - Dot Pointed.docx
@@ -7,20 +7,11 @@
         <w:pStyle w:val="Heading1"/>
         <w:rPr>
           <w:b/>
-          <w:rPrChange w:id="3" w:author="Efraim Taranto" w:date="2026-08-25T10:17:00Z" w16du:dateUtc="2026-08-25T00:17:00Z">
-            <w:rPr/>
-          </w:rPrChange>
         </w:rPr>
-        <w:pPrChange w:id="4" w:author="Efraim Taranto" w:date="2026-08-25T10:17:00Z" w16du:dateUtc="2026-08-25T00:17:00Z">
-          <w:pPr/>
-        </w:pPrChange>
       </w:pPr>
       <w:r>
         <w:rPr>
           <w:b/>
-          <w:rPrChange w:id="5" w:author="Efraim Taranto" w:date="2026-08-25T10:17:00Z" w16du:dateUtc="2026-08-25T00:17:00Z">
-            <w:rPr/>
-          </w:rPrChange>
         </w:rPr>
         <w:t>LinkedIn Changes</w:t>
       </w:r>
@@ -28,9 +19,6 @@
     <w:p>
       <w:pPr>
         <w:pStyle w:val="Heading2"/>
-        <w:pPrChange w:id="6" w:author="Efraim Taranto" w:date="2026-08-25T10:17:00Z" w16du:dateUtc="2026-08-25T00:17:00Z">
-          <w:pPr/>
-        </w:pPrChange>
       </w:pPr>
       <w:r>
         <w:t>Guidelines</w:t>
@@ -40,9 +28,6 @@
       <w:r>
         <w:rPr>
           <w:b/>
-          <w:rPrChange w:id="7" w:author="Efraim Taranto" w:date="2026-08-25T10:17:00Z" w16du:dateUtc="2026-08-25T00:17:00Z">
-            <w:rPr/>
-          </w:rPrChange>
         </w:rPr>
         <w:t>Tone</w:t>
       </w:r>
@@ -78,9 +63,6 @@
       <w:r>
         <w:rPr>
           <w:b/>
-          <w:rPrChange w:id="8" w:author="Efraim Taranto" w:date="2026-08-25T10:17:00Z" w16du:dateUtc="2026-08-25T00:17:00Z">
-            <w:rPr/>
-          </w:rPrChange>
         </w:rPr>
         <w:t>Action and voice</w:t>
       </w:r>
@@ -91,9 +73,6 @@
     <w:p>
       <w:pPr>
         <w:pStyle w:val="Heading2"/>
-        <w:pPrChange w:id="9" w:author="Efraim Taranto" w:date="2026-08-25T10:17:00Z" w16du:dateUtc="2026-08-25T00:17:00Z">
-          <w:pPr/>
-        </w:pPrChange>
       </w:pPr>
       <w:r>
         <w:t>Sections to cover</w:t>
@@ -171,9 +150,6 @@
     <w:p>
       <w:pPr>
         <w:pStyle w:val="Heading2"/>
-        <w:pPrChange w:id="10" w:author="Efraim Taranto" w:date="2026-08-25T10:17:00Z" w16du:dateUtc="2026-08-25T00:17:00Z">
-          <w:pPr/>
-        </w:pPrChange>
       </w:pPr>
       <w:r>
         <w:lastRenderedPageBreak/>
@@ -184,76 +160,43 @@
       <w:r>
         <w:t>Versatile Systems Engineer</w:t>
       </w:r>
-      <w:ins w:id="11" w:author="Efraim Taranto" w:date="2026-08-25T10:17:00Z" w16du:dateUtc="2026-08-25T00:17:00Z">
-        <w:r>
-          <w:t xml:space="preserve"> who moves confidently</w:t>
-        </w:r>
-      </w:ins>
-      <w:del w:id="12" w:author="Efraim Taranto" w:date="2026-08-25T10:17:00Z" w16du:dateUtc="2026-08-25T00:17:00Z">
-        <w:r>
-          <w:delText>, capable of m</w:delText>
-        </w:r>
-        <w:r>
-          <w:delText>oving</w:delText>
-        </w:r>
-      </w:del>
+      <w:r>
+        <w:t xml:space="preserve"> who moves confidently</w:t>
+      </w:r>
       <w:r>
         <w:t xml:space="preserve"> across architecture, DevSecOps, test automation and delivery leadership</w:t>
       </w:r>
-      <w:ins w:id="13" w:author="Efraim Taranto" w:date="2026-08-25T10:17:00Z" w16du:dateUtc="2026-08-25T00:17:00Z">
-        <w:r>
-          <w:t>, adapting quickly</w:t>
-        </w:r>
-      </w:ins>
+      <w:r>
+        <w:t>, adapting quickly</w:t>
+      </w:r>
       <w:r>
         <w:t xml:space="preserve"> to </w:t>
       </w:r>
-      <w:ins w:id="14" w:author="Efraim Taranto" w:date="2026-08-25T10:17:00Z" w16du:dateUtc="2026-08-25T00:17:00Z">
-        <w:r>
-          <w:t>new roles and</w:t>
-        </w:r>
-      </w:ins>
-      <w:del w:id="15" w:author="Efraim Taranto" w:date="2026-08-25T10:17:00Z" w16du:dateUtc="2026-08-25T00:17:00Z">
-        <w:r>
-          <w:delText>turn</w:delText>
-        </w:r>
-      </w:del>
+      <w:r>
+        <w:t>new roles and</w:t>
+      </w:r>
       <w:r>
         <w:t xml:space="preserve"> complex </w:t>
       </w:r>
-      <w:ins w:id="16" w:author="Efraim Taranto" w:date="2026-08-25T10:17:00Z" w16du:dateUtc="2026-08-25T00:17:00Z">
-        <w:r>
-          <w:t>environments to translate technical challenges</w:t>
-        </w:r>
-      </w:ins>
-      <w:del w:id="17" w:author="Efraim Taranto" w:date="2026-08-25T10:17:00Z" w16du:dateUtc="2026-08-25T00:17:00Z">
-        <w:r>
-          <w:delText>problems</w:delText>
-        </w:r>
-      </w:del>
+      <w:r>
+        <w:t>environments to translate technical challenges</w:t>
+      </w:r>
       <w:r>
         <w:t xml:space="preserve"> into reliable </w:t>
       </w:r>
-      <w:ins w:id="18" w:author="Efraim Taranto" w:date="2026-08-25T10:17:00Z" w16du:dateUtc="2026-08-25T00:17:00Z">
-        <w:r>
-          <w:t xml:space="preserve">platforms, stronger teams and measurable </w:t>
-        </w:r>
-      </w:ins>
+      <w:r>
+        <w:t xml:space="preserve">platforms, stronger teams and measurable </w:t>
+      </w:r>
       <w:r>
         <w:t>business value</w:t>
       </w:r>
-      <w:ins w:id="19" w:author="Efraim Taranto" w:date="2026-08-25T10:17:00Z" w16du:dateUtc="2026-08-25T00:17:00Z">
-        <w:r>
-          <w:t>.</w:t>
-        </w:r>
-      </w:ins>
+      <w:r>
+        <w:t>.</w:t>
+      </w:r>
     </w:p>
     <w:p>
       <w:pPr>
         <w:pStyle w:val="Heading2"/>
-        <w:pPrChange w:id="20" w:author="Efraim Taranto" w:date="2026-08-25T10:17:00Z" w16du:dateUtc="2026-08-25T00:17:00Z">
-          <w:pPr/>
-        </w:pPrChange>
       </w:pPr>
       <w:r>
         <w:t>About</w:t>
@@ -590,31 +533,21 @@
       <w:r>
         <w:t xml:space="preserve">to do </w:t>
       </w:r>
-      <w:ins w:id="21" w:author="Efraim Taranto" w:date="2026-08-25T10:17:00Z" w16du:dateUtc="2026-08-25T00:17:00Z">
-        <w:r>
-          <w:t xml:space="preserve">their </w:t>
-        </w:r>
-        <w:r>
-          <w:t>work</w:t>
-        </w:r>
-        <w:r>
-          <w:t xml:space="preserve"> to the best of their abilities</w:t>
-        </w:r>
-        <w:r>
-          <w:t>;</w:t>
-        </w:r>
-        <w:r>
-          <w:t xml:space="preserve"> </w:t>
-        </w:r>
-      </w:ins>
-      <w:del w:id="22" w:author="Efraim Taranto" w:date="2026-08-25T10:17:00Z" w16du:dateUtc="2026-08-25T00:17:00Z">
-        <w:r>
-          <w:delText>excellent work</w:delText>
-        </w:r>
-        <w:r>
-          <w:delText>—</w:delText>
-        </w:r>
-      </w:del>
+      <w:r>
+        <w:t xml:space="preserve">their </w:t>
+      </w:r>
+      <w:r>
+        <w:t>work</w:t>
+      </w:r>
+      <w:r>
+        <w:t xml:space="preserve"> to the best of their abilities</w:t>
+      </w:r>
+      <w:r>
+        <w:t>;</w:t>
+      </w:r>
+      <w:r>
+        <w:t xml:space="preserve"> </w:t>
+      </w:r>
       <w:r>
         <w:t>with</w:t>
       </w:r>
@@ -647,18 +580,9 @@
       <w:pPr>
         <w:pStyle w:val="Heading2"/>
         <w:rPr>
-          <w:rPrChange w:id="23" w:author="Efraim Taranto" w:date="2026-08-25T10:17:00Z" w16du:dateUtc="2026-08-25T00:17:00Z">
-            <w:rPr>
-              <w:b/>
-              <w:bCs/>
-              <w:sz w:val="32"/>
-              <w:szCs w:val="32"/>
-            </w:rPr>
-          </w:rPrChange>
+          <w:b w:val="0"/>
+          <w:bCs w:val="0"/>
         </w:rPr>
-        <w:pPrChange w:id="24" w:author="Efraim Taranto" w:date="2026-08-25T10:17:00Z" w16du:dateUtc="2026-08-25T00:17:00Z">
-          <w:pPr/>
-        </w:pPrChange>
       </w:pPr>
       <w:r>
         <w:t>Working Experience</w:t>
@@ -667,19 +591,8 @@
     <w:p>
       <w:pPr>
         <w:pStyle w:val="Heading3"/>
-        <w:pPrChange w:id="25" w:author="Efraim Taranto" w:date="2026-08-25T10:17:00Z" w16du:dateUtc="2026-08-25T00:17:00Z">
-          <w:pPr/>
-        </w:pPrChange>
-      </w:pPr>
-      <w:r>
-        <w:rPr>
-          <w:rPrChange w:id="26" w:author="Efraim Taranto" w:date="2026-08-25T10:17:00Z" w16du:dateUtc="2026-08-25T00:17:00Z">
-            <w:rPr>
-              <w:b/>
-              <w:bCs/>
-            </w:rPr>
-          </w:rPrChange>
-        </w:rPr>
+      </w:pPr>
+      <w:r>
         <w:t>Origin Energy</w:t>
       </w:r>
     </w:p>
@@ -688,13 +601,7 @@
         <w:pStyle w:val="Heading4"/>
         <w:rPr>
           <w:i/>
-          <w:rPrChange w:id="27" w:author="Efraim Taranto" w:date="2026-08-25T10:17:00Z" w16du:dateUtc="2026-08-25T00:17:00Z">
-            <w:rPr/>
-          </w:rPrChange>
         </w:rPr>
-        <w:pPrChange w:id="28" w:author="Efraim Taranto" w:date="2026-08-25T10:17:00Z" w16du:dateUtc="2026-08-25T00:17:00Z">
-          <w:pPr/>
-        </w:pPrChange>
       </w:pPr>
       <w:r>
         <w:rPr>
@@ -764,10 +671,7 @@
         </w:numPr>
       </w:pPr>
       <w:r>
-        <w:t xml:space="preserve">Engineered an in-house </w:t>
-      </w:r>
-      <w:r>
-        <w:t>Salesforce application that standardised release management across five Salesforce orgs</w:t>
+        <w:t>Engineered an in-house Salesforce application that standardised release management across five Salesforce orgs</w:t>
       </w:r>
       <w:r>
         <w:t>, allowing</w:t>
@@ -824,10 +728,7 @@
         </w:numPr>
       </w:pPr>
       <w:r>
-        <w:t xml:space="preserve">Designed and built an automated recurring-order scheduler supporting more than 50,000 points of delivery, </w:t>
-      </w:r>
-      <w:r>
-        <w:t xml:space="preserve">saving the business 3,000 operational hours each year </w:t>
+        <w:t xml:space="preserve">Designed and built an automated recurring-order scheduler supporting more than 50,000 points of delivery, saving the business 3,000 operational hours each year </w:t>
       </w:r>
       <w:r>
         <w:t>when setting up</w:t>
@@ -844,7 +745,15 @@
         </w:numPr>
       </w:pPr>
       <w:r>
-        <w:t>Established the Salesforce Agile Scrumban operating model across multiple squads, facilitating ceremonies and mentoring developers</w:t>
+        <w:t xml:space="preserve">Established the Salesforce Agile </w:t>
+      </w:r>
+      <w:proofErr w:type="spellStart"/>
+      <w:r>
+        <w:t>Scrumban</w:t>
+      </w:r>
+      <w:proofErr w:type="spellEnd"/>
+      <w:r>
+        <w:t xml:space="preserve"> operating model across multiple squads, facilitating ceremonies and mentoring developers</w:t>
       </w:r>
       <w:r>
         <w:t>, business analysts and testers.</w:t>
@@ -864,20 +773,519 @@
     <w:p>
       <w:pPr>
         <w:pStyle w:val="Heading3"/>
-        <w:pPrChange w:id="29" w:author="Efraim Taranto" w:date="2026-08-25T10:17:00Z" w16du:dateUtc="2026-08-25T00:17:00Z">
-          <w:pPr/>
-        </w:pPrChange>
-      </w:pPr>
-      <w:r>
-        <w:t>Community &amp; Pro Bono</w:t>
+      </w:pPr>
+      <w:r>
+        <w:t>JB Hi-Fi</w:t>
       </w:r>
     </w:p>
     <w:p>
       <w:pPr>
         <w:pStyle w:val="Heading4"/>
-        <w:pPrChange w:id="30" w:author="Efraim Taranto" w:date="2026-08-25T10:17:00Z" w16du:dateUtc="2026-08-25T00:17:00Z">
-          <w:pPr/>
-        </w:pPrChange>
+      </w:pPr>
+      <w:r>
+        <w:rPr>
+          <w:b/>
+          <w:bCs/>
+        </w:rPr>
+        <w:t>Salesforce Iteration Manager &amp; Test Automation Lead</w:t>
+      </w:r>
+      <w:r>
+        <w:t xml:space="preserve"> </w:t>
+      </w:r>
+      <w:r>
+        <w:rPr>
+          <w:i/>
+        </w:rPr>
+        <w:t>(Jul 2016 – Feb 2018)</w:t>
+      </w:r>
+    </w:p>
+    <w:p>
+      <w:pPr>
+        <w:pStyle w:val="ListParagraph"/>
+        <w:numPr>
+          <w:ilvl w:val="0"/>
+          <w:numId w:val="5"/>
+        </w:numPr>
+      </w:pPr>
+      <w:r>
+        <w:t>Led</w:t>
+      </w:r>
+      <w:r>
+        <w:t xml:space="preserve"> a cross-functional squad of developers, business analysts, and testers delivering work across Salesforce Sales Cloud, the commercial e-commerce site, and education BYOD portals.</w:t>
+      </w:r>
+    </w:p>
+    <w:p>
+      <w:pPr>
+        <w:pStyle w:val="ListParagraph"/>
+        <w:numPr>
+          <w:ilvl w:val="0"/>
+          <w:numId w:val="5"/>
+        </w:numPr>
+      </w:pPr>
+      <w:r>
+        <w:t>Developed</w:t>
+      </w:r>
+      <w:r>
+        <w:t xml:space="preserve"> an automated testing framework using Selenium, Java, and Cucumber, accelerating regression testing</w:t>
+      </w:r>
+      <w:r>
+        <w:t xml:space="preserve"> for digital releases and improving repeatability across the squad.</w:t>
+      </w:r>
+    </w:p>
+    <w:p>
+      <w:pPr>
+        <w:pStyle w:val="ListParagraph"/>
+        <w:numPr>
+          <w:ilvl w:val="0"/>
+          <w:numId w:val="5"/>
+        </w:numPr>
+      </w:pPr>
+      <w:r>
+        <w:t>Extended</w:t>
+      </w:r>
+      <w:r>
+        <w:t xml:space="preserve"> functional automation into JMeter and </w:t>
+      </w:r>
+      <w:proofErr w:type="spellStart"/>
+      <w:r>
+        <w:t>BlazeMeter</w:t>
+      </w:r>
+      <w:proofErr w:type="spellEnd"/>
+      <w:r>
+        <w:t xml:space="preserve"> load tests that simulated 50,000 concurrent users, helping tune AWS infrastructure for peak retail events including Black Friday and Boxing Day.</w:t>
+      </w:r>
+    </w:p>
+    <w:p>
+      <w:pPr>
+        <w:numPr>
+          <w:ilvl w:val="0"/>
+          <w:numId w:val="5"/>
+        </w:numPr>
+      </w:pPr>
+      <w:r>
+        <w:lastRenderedPageBreak/>
+        <w:t xml:space="preserve">Delivered corporate procurement integrations with Salesforce for major enterprise clients, establishing strict security and transaction audit controls. </w:t>
+      </w:r>
+    </w:p>
+    <w:p>
+      <w:pPr>
+        <w:pStyle w:val="Heading3"/>
+      </w:pPr>
+      <w:r>
+        <w:t>Jemena</w:t>
+      </w:r>
+    </w:p>
+    <w:p>
+      <w:pPr>
+        <w:pStyle w:val="Heading4"/>
+      </w:pPr>
+      <w:r>
+        <w:rPr>
+          <w:b/>
+          <w:bCs/>
+        </w:rPr>
+        <w:t>Test Automation Lead</w:t>
+      </w:r>
+      <w:r>
+        <w:t xml:space="preserve"> </w:t>
+      </w:r>
+      <w:r>
+        <w:rPr>
+          <w:i/>
+        </w:rPr>
+        <w:t>(Jan 2011 – Jul 2016)</w:t>
+      </w:r>
+    </w:p>
+    <w:p>
+      <w:pPr>
+        <w:numPr>
+          <w:ilvl w:val="0"/>
+          <w:numId w:val="6"/>
+        </w:numPr>
+      </w:pPr>
+      <w:r>
+        <w:t xml:space="preserve">Directed and mentored a team of four automation engineers, defining end-to-end testing strategies combining automated and manual verification. </w:t>
+      </w:r>
+    </w:p>
+    <w:p>
+      <w:pPr>
+        <w:pStyle w:val="ListParagraph"/>
+        <w:numPr>
+          <w:ilvl w:val="0"/>
+          <w:numId w:val="6"/>
+        </w:numPr>
+      </w:pPr>
+      <w:r>
+        <w:t>Built</w:t>
+      </w:r>
+      <w:r>
+        <w:t xml:space="preserve"> automated reporting tools that combined Jira, HP Quality </w:t>
+      </w:r>
+      <w:proofErr w:type="spellStart"/>
+      <w:r>
+        <w:t>Center</w:t>
+      </w:r>
+      <w:proofErr w:type="spellEnd"/>
+      <w:r>
+        <w:t>, Microsoft Project, and Excel metrics, saving more than 1,600 hours annually across project-management streams.</w:t>
+      </w:r>
+    </w:p>
+    <w:p>
+      <w:pPr>
+        <w:numPr>
+          <w:ilvl w:val="0"/>
+          <w:numId w:val="6"/>
+        </w:numPr>
+      </w:pPr>
+      <w:r>
+        <w:t xml:space="preserve">Delivered regression suites across SAP ERP, SAP HR/Payroll, and SAP IS/U platforms, accelerating defect detection and freeing manual testing capacity. </w:t>
+      </w:r>
+    </w:p>
+    <w:p>
+      <w:pPr>
+        <w:numPr>
+          <w:ilvl w:val="0"/>
+          <w:numId w:val="6"/>
+        </w:numPr>
+      </w:pPr>
+      <w:r>
+        <w:t xml:space="preserve">Customized HP Quality </w:t>
+      </w:r>
+      <w:proofErr w:type="spellStart"/>
+      <w:r>
+        <w:t>Center</w:t>
+      </w:r>
+      <w:proofErr w:type="spellEnd"/>
+      <w:r>
+        <w:t xml:space="preserve"> to build an autonomous testing framework covering SAP IS/U and critical Jemena–AEMO web service integrations.</w:t>
+      </w:r>
+    </w:p>
+    <w:p>
+      <w:pPr>
+        <w:pStyle w:val="Heading3"/>
+      </w:pPr>
+      <w:r>
+        <w:t>Revolution IT</w:t>
+      </w:r>
+    </w:p>
+    <w:p>
+      <w:pPr>
+        <w:pStyle w:val="Heading4"/>
+      </w:pPr>
+      <w:r>
+        <w:rPr>
+          <w:b/>
+          <w:bCs/>
+        </w:rPr>
+        <w:t>Senior Technical Consultant</w:t>
+      </w:r>
+      <w:r>
+        <w:t xml:space="preserve"> </w:t>
+      </w:r>
+      <w:r>
+        <w:rPr>
+          <w:i/>
+        </w:rPr>
+        <w:t>(Jun 2008 – Jan 2011)</w:t>
+      </w:r>
+    </w:p>
+    <w:p>
+      <w:pPr>
+        <w:pStyle w:val="ListParagraph"/>
+        <w:numPr>
+          <w:ilvl w:val="0"/>
+          <w:numId w:val="7"/>
+        </w:numPr>
+      </w:pPr>
+      <w:r>
+        <w:t>Established</w:t>
+      </w:r>
+      <w:r>
+        <w:t xml:space="preserve"> automated test frameworks using HP UFT/QTP and coached client teams in Test-Driven Development practices, leaving them with both reusable automation and the skills to sustain it.</w:t>
+      </w:r>
+    </w:p>
+    <w:p>
+      <w:pPr>
+        <w:numPr>
+          <w:ilvl w:val="0"/>
+          <w:numId w:val="7"/>
+        </w:numPr>
+      </w:pPr>
+      <w:r>
+        <w:t xml:space="preserve">Built the end-to-end automated test suite for Australia Post Identification Services, verifying customized identity forms across government agency requirements. </w:t>
+      </w:r>
+    </w:p>
+    <w:p>
+      <w:pPr>
+        <w:numPr>
+          <w:ilvl w:val="0"/>
+          <w:numId w:val="7"/>
+        </w:numPr>
+      </w:pPr>
+      <w:r>
+        <w:t xml:space="preserve">Created a business reporting framework integrating consultant timesheets with MYOB to give leadership clear visibility into resource profitability. </w:t>
+      </w:r>
+    </w:p>
+    <w:p>
+      <w:pPr>
+        <w:numPr>
+          <w:ilvl w:val="0"/>
+          <w:numId w:val="7"/>
+        </w:numPr>
+      </w:pPr>
+      <w:r>
+        <w:t xml:space="preserve">Delivered Training courses on HP Quality </w:t>
+      </w:r>
+      <w:proofErr w:type="spellStart"/>
+      <w:r>
+        <w:t>Center</w:t>
+      </w:r>
+      <w:proofErr w:type="spellEnd"/>
+      <w:r>
+        <w:t>, usage and technical configuration as well as training courses on HP UFT.</w:t>
+      </w:r>
+    </w:p>
+    <w:p>
+      <w:pPr>
+        <w:pStyle w:val="Heading3"/>
+      </w:pPr>
+      <w:proofErr w:type="spellStart"/>
+      <w:r>
+        <w:t>EastLink</w:t>
+      </w:r>
+      <w:proofErr w:type="spellEnd"/>
+    </w:p>
+    <w:p>
+      <w:pPr>
+        <w:pStyle w:val="Heading4"/>
+      </w:pPr>
+      <w:r>
+        <w:rPr>
+          <w:b/>
+          <w:bCs/>
+        </w:rPr>
+        <w:t>Test Automation Lead &amp; Requirements Engineer</w:t>
+      </w:r>
+      <w:r>
+        <w:t xml:space="preserve"> </w:t>
+      </w:r>
+      <w:r>
+        <w:rPr>
+          <w:i/>
+        </w:rPr>
+        <w:t>(Jul 2005 – Jun 2008)</w:t>
+      </w:r>
+    </w:p>
+    <w:p>
+      <w:pPr>
+        <w:pStyle w:val="ListParagraph"/>
+        <w:numPr>
+          <w:ilvl w:val="0"/>
+          <w:numId w:val="8"/>
+        </w:numPr>
+      </w:pPr>
+      <w:r>
+        <w:t>Captured</w:t>
+      </w:r>
+      <w:r>
+        <w:t xml:space="preserve"> core system specifications and established end-to-end requirements traceability in HP Quality </w:t>
+      </w:r>
+      <w:proofErr w:type="spellStart"/>
+      <w:r>
+        <w:t>Center</w:t>
+      </w:r>
+      <w:proofErr w:type="spellEnd"/>
+      <w:r>
+        <w:t>, creating a reliable foundation for Test-Driven Development and system verification.</w:t>
+      </w:r>
+    </w:p>
+    <w:p>
+      <w:pPr>
+        <w:numPr>
+          <w:ilvl w:val="0"/>
+          <w:numId w:val="8"/>
+        </w:numPr>
+      </w:pPr>
+      <w:r>
+        <w:t xml:space="preserve">Led a team of four automation testers, building test suites across the Toll Operating System, SAP IS/U, and customer web portals to accelerate system cutover. </w:t>
+      </w:r>
+    </w:p>
+    <w:p>
+      <w:pPr>
+        <w:pStyle w:val="Heading3"/>
+      </w:pPr>
+      <w:r>
+        <w:lastRenderedPageBreak/>
+        <w:t>Transurban</w:t>
+      </w:r>
+    </w:p>
+    <w:p>
+      <w:pPr>
+        <w:pStyle w:val="Heading4"/>
+      </w:pPr>
+      <w:r>
+        <w:rPr>
+          <w:b/>
+          <w:bCs/>
+        </w:rPr>
+        <w:t>Software Engineer</w:t>
+      </w:r>
+      <w:r>
+        <w:t xml:space="preserve"> </w:t>
+      </w:r>
+      <w:r>
+        <w:rPr>
+          <w:i/>
+        </w:rPr>
+        <w:t>(Nov 2004 – Jun 2005)</w:t>
+      </w:r>
+    </w:p>
+    <w:p>
+      <w:pPr>
+        <w:numPr>
+          <w:ilvl w:val="0"/>
+          <w:numId w:val="9"/>
+        </w:numPr>
+      </w:pPr>
+      <w:r>
+        <w:t xml:space="preserve">Developed enhancements and data integrations for the Clarify CRM system and </w:t>
+      </w:r>
+      <w:proofErr w:type="spellStart"/>
+      <w:r>
+        <w:t>GATe</w:t>
+      </w:r>
+      <w:proofErr w:type="spellEnd"/>
+      <w:r>
+        <w:t xml:space="preserve"> tolling platforms. </w:t>
+      </w:r>
+    </w:p>
+    <w:p>
+      <w:pPr>
+        <w:numPr>
+          <w:ilvl w:val="0"/>
+          <w:numId w:val="9"/>
+        </w:numPr>
+      </w:pPr>
+      <w:r>
+        <w:t xml:space="preserve">Implemented server-side data masking on CRM databases to safeguard sensitive customer information across non-production environments. </w:t>
+      </w:r>
+    </w:p>
+    <w:p>
+      <w:pPr>
+        <w:pStyle w:val="Heading3"/>
+      </w:pPr>
+      <w:proofErr w:type="spellStart"/>
+      <w:r>
+        <w:t>Quanam</w:t>
+      </w:r>
+      <w:proofErr w:type="spellEnd"/>
+      <w:r>
+        <w:t xml:space="preserve"> &amp; Early Software Engineering</w:t>
+      </w:r>
+    </w:p>
+    <w:p>
+      <w:pPr>
+        <w:pStyle w:val="Heading4"/>
+      </w:pPr>
+      <w:r>
+        <w:rPr>
+          <w:b/>
+          <w:bCs/>
+        </w:rPr>
+        <w:t>PeopleSoft Technical Consultant &amp; Software Developer</w:t>
+      </w:r>
+      <w:r>
+        <w:t xml:space="preserve"> </w:t>
+      </w:r>
+      <w:r>
+        <w:rPr>
+          <w:i/>
+        </w:rPr>
+        <w:t>(Aug 1991 – Aug 2004)</w:t>
+      </w:r>
+    </w:p>
+    <w:p>
+      <w:pPr>
+        <w:pStyle w:val="ListParagraph"/>
+        <w:numPr>
+          <w:ilvl w:val="0"/>
+          <w:numId w:val="10"/>
+        </w:numPr>
+      </w:pPr>
+      <w:r>
+        <w:t>Delivered</w:t>
+      </w:r>
+      <w:r>
+        <w:t xml:space="preserve"> ERP, CRM, and business-intelligence implementations for major regional clients including Banco </w:t>
+      </w:r>
+      <w:r>
+        <w:t xml:space="preserve">de la </w:t>
+      </w:r>
+      <w:proofErr w:type="spellStart"/>
+      <w:r>
+        <w:t>Nación</w:t>
+      </w:r>
+      <w:proofErr w:type="spellEnd"/>
+      <w:r>
+        <w:t xml:space="preserve"> Argentina</w:t>
+      </w:r>
+      <w:r>
+        <w:t>, Novartis, and BellSouth, building the enterprise systems foundation that shaped my later work in architecture, integration, and platform delivery.</w:t>
+      </w:r>
+    </w:p>
+    <w:p>
+      <w:pPr>
+        <w:pStyle w:val="ListParagraph"/>
+        <w:numPr>
+          <w:ilvl w:val="0"/>
+          <w:numId w:val="10"/>
+        </w:numPr>
+      </w:pPr>
+      <w:r>
+        <w:t xml:space="preserve">Delivered training courses on </w:t>
+      </w:r>
+      <w:proofErr w:type="spellStart"/>
+      <w:r>
+        <w:t>PeopleTools</w:t>
+      </w:r>
+      <w:proofErr w:type="spellEnd"/>
+      <w:r>
+        <w:t xml:space="preserve"> (</w:t>
+      </w:r>
+      <w:proofErr w:type="spellStart"/>
+      <w:r>
+        <w:t>PeopleCode</w:t>
+      </w:r>
+      <w:proofErr w:type="spellEnd"/>
+      <w:r>
+        <w:t>, SQR, Application Engine</w:t>
+      </w:r>
+      <w:r>
+        <w:t xml:space="preserve"> and Business Intelligence) as well as functional courses on Procurement, Order Management, Inventory Management and Project Costing.</w:t>
+      </w:r>
+    </w:p>
+    <w:p>
+      <w:pPr>
+        <w:numPr>
+          <w:ilvl w:val="0"/>
+          <w:numId w:val="10"/>
+        </w:numPr>
+      </w:pPr>
+      <w:r>
+        <w:t xml:space="preserve">Built custom applications and database integrations utilizing C++, PowerBuilder, Visual Basic, COBOL, SQL Server, and Oracle. </w:t>
+      </w:r>
+    </w:p>
+    <w:p>
+      <w:pPr>
+        <w:pStyle w:val="Heading3"/>
+      </w:pPr>
+      <w:r>
+        <w:t>Community &amp; Pro Bono</w:t>
+      </w:r>
+    </w:p>
+    <w:p>
+      <w:pPr>
+        <w:pStyle w:val="Heading4"/>
       </w:pPr>
       <w:r>
         <w:rPr>
@@ -905,13 +1313,15 @@
         </w:numPr>
       </w:pPr>
       <w:r>
-        <w:t>Designed</w:t>
-      </w:r>
-      <w:r>
-        <w:t xml:space="preserve"> and deployed </w:t>
-      </w:r>
-      <w:r>
-        <w:t>Salesforce NPSP, Sales Cloud, and Service Cloud solutions for community organisations including CCare, Maccabi Victoria, NCJWA, Souper Kitchen, Beit Raphael, FOJAM, and the John Monash Foundation, tailoring each platform to the organisation’s operating needs.</w:t>
+        <w:t xml:space="preserve">Designed and deployed Salesforce NPSP, Sales Cloud, and Service Cloud solutions for community organisations including </w:t>
+      </w:r>
+      <w:proofErr w:type="spellStart"/>
+      <w:r>
+        <w:t>CCare</w:t>
+      </w:r>
+      <w:proofErr w:type="spellEnd"/>
+      <w:r>
+        <w:t>, Maccabi Victoria, NCJWA, Souper Kitchen, Beit Raphael, FOJAM, and the John Monash Foundation, tailoring each platform to the organisation’s operating needs.</w:t>
       </w:r>
     </w:p>
     <w:p>
@@ -936,129 +1346,20 @@
         <w:t xml:space="preserve">Coached and mentored non-profit administration teams to establish sustainable, low-code platform adoption and internal independence. </w:t>
       </w:r>
     </w:p>
-    <w:p/>
     <w:p>
       <w:pPr>
         <w:pStyle w:val="Heading3"/>
-        <w:pPrChange w:id="31" w:author="Efraim Taranto" w:date="2026-08-25T10:17:00Z" w16du:dateUtc="2026-08-25T00:17:00Z">
-          <w:pPr/>
-        </w:pPrChange>
-      </w:pPr>
-      <w:r>
-        <w:t>JB Hi-Fi</w:t>
+      </w:pPr>
+      <w:r>
+        <w:t>Independent</w:t>
+      </w:r>
+      <w:r>
+        <w:t xml:space="preserve"> Application Development</w:t>
       </w:r>
     </w:p>
     <w:p>
       <w:pPr>
         <w:pStyle w:val="Heading4"/>
-        <w:pPrChange w:id="32" w:author="Efraim Taranto" w:date="2026-08-25T10:17:00Z" w16du:dateUtc="2026-08-25T00:17:00Z">
-          <w:pPr/>
-        </w:pPrChange>
-      </w:pPr>
-      <w:r>
-        <w:rPr>
-          <w:b/>
-          <w:bCs/>
-        </w:rPr>
-        <w:t>Salesforce Iteration Manager &amp; Test Automation Lead</w:t>
-      </w:r>
-      <w:r>
-        <w:t xml:space="preserve"> </w:t>
-      </w:r>
-      <w:r>
-        <w:rPr>
-          <w:i/>
-        </w:rPr>
-        <w:t>(Jul 2016 – Feb 2018)</w:t>
-      </w:r>
-    </w:p>
-    <w:p>
-      <w:pPr>
-        <w:pStyle w:val="ListParagraph"/>
-        <w:numPr>
-          <w:ilvl w:val="0"/>
-          <w:numId w:val="5"/>
-        </w:numPr>
-      </w:pPr>
-      <w:r>
-        <w:t>Led</w:t>
-      </w:r>
-      <w:r>
-        <w:t xml:space="preserve"> a cross-functional squad of developers, business analysts, and testers delivering work across Salesforce Sales Cloud, the commercial e-commerce site, and education BYOD portals.</w:t>
-      </w:r>
-    </w:p>
-    <w:p>
-      <w:pPr>
-        <w:pStyle w:val="ListParagraph"/>
-        <w:numPr>
-          <w:ilvl w:val="0"/>
-          <w:numId w:val="5"/>
-        </w:numPr>
-      </w:pPr>
-      <w:r>
-        <w:t>Developed</w:t>
-      </w:r>
-      <w:r>
-        <w:t xml:space="preserve"> an automated testing framework using Selenium, Java, and Cucumber, accelerating regression testing</w:t>
-      </w:r>
-      <w:r>
-        <w:t xml:space="preserve"> for digital releases and improving repeatability across the squad.</w:t>
-      </w:r>
-    </w:p>
-    <w:p>
-      <w:pPr>
-        <w:pStyle w:val="ListParagraph"/>
-        <w:numPr>
-          <w:ilvl w:val="0"/>
-          <w:numId w:val="5"/>
-        </w:numPr>
-      </w:pPr>
-      <w:r>
-        <w:t>Extended</w:t>
-      </w:r>
-      <w:r>
-        <w:t xml:space="preserve"> functional automation into JMeter and BlazeMeter load tests that simulated 50,000 concurrent users, helping tune AWS infrastructure for peak retail events including Black Friday and Boxing Day.</w:t>
-      </w:r>
-    </w:p>
-    <w:p>
-      <w:pPr>
-        <w:numPr>
-          <w:ilvl w:val="0"/>
-          <w:numId w:val="5"/>
-        </w:numPr>
-      </w:pPr>
-      <w:r>
-        <w:t xml:space="preserve">Delivered corporate procurement integrations with Salesforce for major enterprise clients, establishing strict security and transaction audit controls. </w:t>
-      </w:r>
-    </w:p>
-    <w:p>
-      <w:pPr>
-        <w:pStyle w:val="Heading3"/>
-        <w:pPrChange w:id="33" w:author="Efraim Taranto" w:date="2026-08-25T10:17:00Z" w16du:dateUtc="2026-08-25T00:17:00Z">
-          <w:pPr/>
-        </w:pPrChange>
-      </w:pPr>
-      <w:r>
-        <w:t>Independent</w:t>
-      </w:r>
-      <w:r>
-        <w:rPr>
-          <w:rPrChange w:id="34" w:author="Efraim Taranto" w:date="2026-08-25T10:17:00Z" w16du:dateUtc="2026-08-25T00:17:00Z">
-            <w:rPr>
-              <w:b/>
-              <w:bCs/>
-            </w:rPr>
-          </w:rPrChange>
-        </w:rPr>
-        <w:t xml:space="preserve"> Application Development</w:t>
-      </w:r>
-    </w:p>
-    <w:p>
-      <w:pPr>
-        <w:pStyle w:val="Heading4"/>
-        <w:pPrChange w:id="35" w:author="Efraim Taranto" w:date="2026-08-25T10:17:00Z" w16du:dateUtc="2026-08-25T00:17:00Z">
-          <w:pPr/>
-        </w:pPrChange>
       </w:pPr>
       <w:r>
         <w:rPr>
@@ -1070,9 +1371,6 @@
       <w:r>
         <w:rPr>
           <w:b/>
-          <w:rPrChange w:id="36" w:author="Efraim Taranto" w:date="2026-08-25T10:17:00Z" w16du:dateUtc="2026-08-25T00:17:00Z">
-            <w:rPr/>
-          </w:rPrChange>
         </w:rPr>
         <w:t xml:space="preserve"> </w:t>
       </w:r>
@@ -1114,386 +1412,11 @@
         </w:numPr>
       </w:pPr>
       <w:r>
+        <w:lastRenderedPageBreak/>
         <w:t xml:space="preserve">Configured and deployed prototype database and application servers on AWS to validate multi-tenant hosting scalability. </w:t>
       </w:r>
     </w:p>
-    <w:p>
-      <w:pPr>
-        <w:pStyle w:val="Heading3"/>
-        <w:pPrChange w:id="37" w:author="Efraim Taranto" w:date="2026-08-25T10:17:00Z" w16du:dateUtc="2026-08-25T00:17:00Z">
-          <w:pPr/>
-        </w:pPrChange>
-      </w:pPr>
-      <w:r>
-        <w:t>Jemena</w:t>
-      </w:r>
-    </w:p>
-    <w:p>
-      <w:pPr>
-        <w:pStyle w:val="Heading4"/>
-        <w:pPrChange w:id="38" w:author="Efraim Taranto" w:date="2026-08-25T10:17:00Z" w16du:dateUtc="2026-08-25T00:17:00Z">
-          <w:pPr/>
-        </w:pPrChange>
-      </w:pPr>
-      <w:r>
-        <w:rPr>
-          <w:b/>
-          <w:bCs/>
-        </w:rPr>
-        <w:t>Test Automation Lead</w:t>
-      </w:r>
-      <w:r>
-        <w:t xml:space="preserve"> </w:t>
-      </w:r>
-      <w:r>
-        <w:rPr>
-          <w:i/>
-        </w:rPr>
-        <w:t>(Jan 2011 – Jul 2016)</w:t>
-      </w:r>
-    </w:p>
-    <w:p>
-      <w:pPr>
-        <w:numPr>
-          <w:ilvl w:val="0"/>
-          <w:numId w:val="6"/>
-        </w:numPr>
-      </w:pPr>
-      <w:r>
-        <w:t xml:space="preserve">Directed and mentored a team of four automation engineers, defining end-to-end testing strategies combining automated and manual verification. </w:t>
-      </w:r>
-    </w:p>
-    <w:p>
-      <w:pPr>
-        <w:pStyle w:val="ListParagraph"/>
-        <w:numPr>
-          <w:ilvl w:val="0"/>
-          <w:numId w:val="6"/>
-        </w:numPr>
-      </w:pPr>
-      <w:r>
-        <w:t>Built</w:t>
-      </w:r>
-      <w:r>
-        <w:t xml:space="preserve"> automated reporting tools that combined Jira, HP Quality Center, Microsoft Project, and Excel metrics, saving more than 1,600 hours annually across project-management streams.</w:t>
-      </w:r>
-    </w:p>
-    <w:p>
-      <w:pPr>
-        <w:numPr>
-          <w:ilvl w:val="0"/>
-          <w:numId w:val="6"/>
-        </w:numPr>
-      </w:pPr>
-      <w:r>
-        <w:t xml:space="preserve">Delivered regression suites across SAP ERP, SAP HR/Payroll, and SAP IS/U platforms, accelerating defect detection and freeing manual testing capacity. </w:t>
-      </w:r>
-    </w:p>
-    <w:p>
-      <w:pPr>
-        <w:numPr>
-          <w:ilvl w:val="0"/>
-          <w:numId w:val="6"/>
-        </w:numPr>
-      </w:pPr>
-      <w:r>
-        <w:t>Customized HP Quality Center to build an autonomous testing framework covering SAP IS/U and critical Jemena–AEMO web service integrations.</w:t>
-      </w:r>
-    </w:p>
-    <w:p>
-      <w:pPr>
-        <w:pStyle w:val="Heading3"/>
-        <w:pPrChange w:id="39" w:author="Efraim Taranto" w:date="2026-08-25T10:17:00Z" w16du:dateUtc="2026-08-25T00:17:00Z">
-          <w:pPr/>
-        </w:pPrChange>
-      </w:pPr>
-      <w:r>
-        <w:lastRenderedPageBreak/>
-        <w:t>Revolution IT</w:t>
-      </w:r>
-    </w:p>
-    <w:p>
-      <w:pPr>
-        <w:pStyle w:val="Heading4"/>
-        <w:pPrChange w:id="40" w:author="Efraim Taranto" w:date="2026-08-25T10:17:00Z" w16du:dateUtc="2026-08-25T00:17:00Z">
-          <w:pPr/>
-        </w:pPrChange>
-      </w:pPr>
-      <w:r>
-        <w:rPr>
-          <w:b/>
-          <w:bCs/>
-        </w:rPr>
-        <w:t>Senior Technical Consultant</w:t>
-      </w:r>
-      <w:r>
-        <w:t xml:space="preserve"> </w:t>
-      </w:r>
-      <w:r>
-        <w:rPr>
-          <w:i/>
-        </w:rPr>
-        <w:t>(Jun 2008 – Jan 2011)</w:t>
-      </w:r>
-    </w:p>
-    <w:p>
-      <w:pPr>
-        <w:pStyle w:val="ListParagraph"/>
-        <w:numPr>
-          <w:ilvl w:val="0"/>
-          <w:numId w:val="7"/>
-        </w:numPr>
-      </w:pPr>
-      <w:r>
-        <w:t>Established</w:t>
-      </w:r>
-      <w:r>
-        <w:t xml:space="preserve"> automated test frameworks using HP UFT/QTP and coached client teams in Test-Driven Development practices, leaving them with both reusable automation and the skills to sustain it.</w:t>
-      </w:r>
-    </w:p>
-    <w:p>
-      <w:pPr>
-        <w:numPr>
-          <w:ilvl w:val="0"/>
-          <w:numId w:val="7"/>
-        </w:numPr>
-      </w:pPr>
-      <w:r>
-        <w:t xml:space="preserve">Built the end-to-end automated test suite for Australia Post Identification Services, verifying customized identity forms across government agency requirements. </w:t>
-      </w:r>
-    </w:p>
-    <w:p>
-      <w:pPr>
-        <w:numPr>
-          <w:ilvl w:val="0"/>
-          <w:numId w:val="7"/>
-        </w:numPr>
-      </w:pPr>
-      <w:r>
-        <w:t xml:space="preserve">Created a business reporting framework integrating consultant timesheets with MYOB to give leadership clear visibility into resource profitability. </w:t>
-      </w:r>
-    </w:p>
-    <w:p>
-      <w:pPr>
-        <w:numPr>
-          <w:ilvl w:val="0"/>
-          <w:numId w:val="7"/>
-        </w:numPr>
-      </w:pPr>
-      <w:r>
-        <w:t>Delivered Training courses on HP Quality Center</w:t>
-      </w:r>
-      <w:r>
-        <w:t>, usage and technical configuration as well as training courses on HP UFT.</w:t>
-      </w:r>
-    </w:p>
-    <w:p>
-      <w:pPr>
-        <w:pStyle w:val="Heading3"/>
-        <w:pPrChange w:id="41" w:author="Efraim Taranto" w:date="2026-08-25T10:17:00Z" w16du:dateUtc="2026-08-25T00:17:00Z">
-          <w:pPr/>
-        </w:pPrChange>
-      </w:pPr>
-      <w:r>
-        <w:t>EastLink</w:t>
-      </w:r>
-    </w:p>
-    <w:p>
-      <w:pPr>
-        <w:pStyle w:val="Heading4"/>
-        <w:pPrChange w:id="42" w:author="Efraim Taranto" w:date="2026-08-25T10:17:00Z" w16du:dateUtc="2026-08-25T00:17:00Z">
-          <w:pPr/>
-        </w:pPrChange>
-      </w:pPr>
-      <w:r>
-        <w:rPr>
-          <w:b/>
-          <w:bCs/>
-        </w:rPr>
-        <w:t>Test Automation Lead &amp; Requirements Engineer</w:t>
-      </w:r>
-      <w:r>
-        <w:t xml:space="preserve"> </w:t>
-      </w:r>
-      <w:r>
-        <w:rPr>
-          <w:i/>
-        </w:rPr>
-        <w:t>(Jul 2005 – Jun 2008)</w:t>
-      </w:r>
-    </w:p>
-    <w:p>
-      <w:pPr>
-        <w:pStyle w:val="ListParagraph"/>
-        <w:numPr>
-          <w:ilvl w:val="0"/>
-          <w:numId w:val="8"/>
-        </w:numPr>
-      </w:pPr>
-      <w:r>
-        <w:t>Captured</w:t>
-      </w:r>
-      <w:r>
-        <w:t xml:space="preserve"> core system specifications and established end-to-end requirements traceability in HP Quality Center, creating a reliable foundation for Test-Driven Development and system verification.</w:t>
-      </w:r>
-    </w:p>
-    <w:p>
-      <w:pPr>
-        <w:numPr>
-          <w:ilvl w:val="0"/>
-          <w:numId w:val="8"/>
-        </w:numPr>
-      </w:pPr>
-      <w:r>
-        <w:t xml:space="preserve">Led a team of four automation testers, building test suites across the Toll Operating System, SAP IS/U, and customer web portals to accelerate system cutover. </w:t>
-      </w:r>
-    </w:p>
-    <w:p>
-      <w:pPr>
-        <w:pStyle w:val="Heading3"/>
-        <w:pPrChange w:id="43" w:author="Efraim Taranto" w:date="2026-08-25T10:17:00Z" w16du:dateUtc="2026-08-25T00:17:00Z">
-          <w:pPr/>
-        </w:pPrChange>
-      </w:pPr>
-      <w:r>
-        <w:t>Transurban</w:t>
-      </w:r>
-    </w:p>
-    <w:p>
-      <w:pPr>
-        <w:pStyle w:val="Heading4"/>
-        <w:pPrChange w:id="44" w:author="Efraim Taranto" w:date="2026-08-25T10:17:00Z" w16du:dateUtc="2026-08-25T00:17:00Z">
-          <w:pPr/>
-        </w:pPrChange>
-      </w:pPr>
-      <w:r>
-        <w:rPr>
-          <w:b/>
-          <w:bCs/>
-        </w:rPr>
-        <w:t>Software Engineer</w:t>
-      </w:r>
-      <w:r>
-        <w:t xml:space="preserve"> </w:t>
-      </w:r>
-      <w:r>
-        <w:rPr>
-          <w:i/>
-        </w:rPr>
-        <w:t>(Nov 2004 – Jun 2005)</w:t>
-      </w:r>
-    </w:p>
-    <w:p>
-      <w:pPr>
-        <w:numPr>
-          <w:ilvl w:val="0"/>
-          <w:numId w:val="9"/>
-        </w:numPr>
-      </w:pPr>
-      <w:r>
-        <w:t xml:space="preserve">Developed enhancements and data integrations for the Clarify CRM system and GATe tolling platforms. </w:t>
-      </w:r>
-    </w:p>
-    <w:p>
-      <w:pPr>
-        <w:numPr>
-          <w:ilvl w:val="0"/>
-          <w:numId w:val="9"/>
-        </w:numPr>
-      </w:pPr>
-      <w:r>
-        <w:t xml:space="preserve">Implemented server-side data masking on CRM databases to safeguard sensitive customer information across non-production environments. </w:t>
-      </w:r>
-    </w:p>
-    <w:p>
-      <w:pPr>
-        <w:pStyle w:val="Heading3"/>
-        <w:pPrChange w:id="45" w:author="Efraim Taranto" w:date="2026-08-25T10:17:00Z" w16du:dateUtc="2026-08-25T00:17:00Z">
-          <w:pPr/>
-        </w:pPrChange>
-      </w:pPr>
-      <w:r>
-        <w:t>Quanam &amp; Early Software Engineering</w:t>
-      </w:r>
-    </w:p>
-    <w:p>
-      <w:pPr>
-        <w:pStyle w:val="Heading4"/>
-        <w:pPrChange w:id="46" w:author="Efraim Taranto" w:date="2026-08-25T10:17:00Z" w16du:dateUtc="2026-08-25T00:17:00Z">
-          <w:pPr/>
-        </w:pPrChange>
-      </w:pPr>
-      <w:r>
-        <w:rPr>
-          <w:b/>
-          <w:bCs/>
-        </w:rPr>
-        <w:t>PeopleSoft Technical Consultant &amp; Software Developer</w:t>
-      </w:r>
-      <w:r>
-        <w:t xml:space="preserve"> </w:t>
-      </w:r>
-      <w:r>
-        <w:rPr>
-          <w:i/>
-        </w:rPr>
-        <w:t>(Aug 1991 – Aug 2004)</w:t>
-      </w:r>
-    </w:p>
-    <w:p>
-      <w:pPr>
-        <w:pStyle w:val="ListParagraph"/>
-        <w:numPr>
-          <w:ilvl w:val="0"/>
-          <w:numId w:val="10"/>
-        </w:numPr>
-      </w:pPr>
-      <w:r>
-        <w:t>Delivered</w:t>
-      </w:r>
-      <w:r>
-        <w:t xml:space="preserve"> ERP, CRM, and business-intelligence implementations for major regional clients including Banco </w:t>
-      </w:r>
-      <w:r>
-        <w:t xml:space="preserve">de la </w:t>
-      </w:r>
-      <w:r>
-        <w:t>Nación</w:t>
-      </w:r>
-      <w:r>
-        <w:t xml:space="preserve"> Argentina</w:t>
-      </w:r>
-      <w:r>
-        <w:t>, Novartis, and BellSouth, building the enterprise systems foundation that shaped my later work in architecture, integration, and platform delivery.</w:t>
-      </w:r>
-    </w:p>
-    <w:p>
-      <w:pPr>
-        <w:pStyle w:val="ListParagraph"/>
-        <w:numPr>
-          <w:ilvl w:val="0"/>
-          <w:numId w:val="10"/>
-        </w:numPr>
-      </w:pPr>
-      <w:r>
-        <w:t>Delivered training courses on PeopleTools (PeopleCode, SQR, Application Engine</w:t>
-      </w:r>
-      <w:r>
-        <w:t xml:space="preserve"> and Business Intelligence) as well as functional courses on Procurement, Order Management, Inventory Management and Project Costing.</w:t>
-      </w:r>
-    </w:p>
-    <w:p>
-      <w:pPr>
-        <w:numPr>
-          <w:ilvl w:val="0"/>
-          <w:numId w:val="10"/>
-        </w:numPr>
-      </w:pPr>
-      <w:r>
-        <w:lastRenderedPageBreak/>
-        <w:t xml:space="preserve">Built custom applications and database integrations utilizing C++, PowerBuilder, Visual Basic, COBOL, SQL Server, and Oracle. </w:t>
-      </w:r>
-    </w:p>
+    <w:p/>
     <w:p/>
     <w:p/>
     <w:sectPr>
@@ -8197,14 +8120,6 @@
     <w:abstractNumId w:val="1"/>
   </w:num>
 </w:numbering>
-</file>
-
-<file path=word/people.xml><?xml version="1.0" encoding="utf-8"?>
-<w15:people xmlns:wpc="http://schemas.microsoft.com/office/word/2010/wordprocessingCanvas" xmlns:cx="http://schemas.microsoft.com/office/drawing/2014/chartex" xmlns:cx1="http://schemas.microsoft.com/office/drawing/2015/9/8/chartex" xmlns:cx2="http://schemas.microsoft.com/office/drawing/2015/10/21/chartex" xmlns:cx3="http://schemas.microsoft.com/office/drawing/2016/5/9/chartex" xmlns:cx4="http://schemas.microsoft.com/office/drawing/2016/5/10/chartex" xmlns:cx5="http://schemas.microsoft.com/office/drawing/2016/5/11/chartex" xmlns:cx6="http://schemas.microsoft.com/office/drawing/2016/5/12/chartex" xmlns:cx7="http://schemas.microsoft.com/office/drawing/2016/5/13/chartex" xmlns:cx8="http://schemas.microsoft.com/office/drawing/2016/5/14/chartex" xmlns:mc="http://schemas.openxmlformats.org/markup-compatibility/2006" xmlns:aink="http://schemas.microsoft.com/office/drawing/2016/ink" xmlns:am3d="http://schemas.microsoft.com/office/drawing/2017/model3d" xmlns:o="urn:schemas-microsoft-com:office:office" xmlns:oel="http://schemas.microsoft.com/office/2019/extlst" xmlns:r="http://schemas.openxmlformats.org/officeDocument/2006/relationships" xmlns:m="http://schemas.openxmlformats.org/officeDocument/2006/math" xmlns:v="urn:schemas-microsoft-com:vml" xmlns:wp14="http://schemas.microsoft.com/office/word/2010/wordprocessingDrawing" xmlns:wp="http://schemas.openxmlformats.org/drawingml/2006/wordprocessingDrawing" xmlns:w10="urn:schemas-microsoft-com:office:word" xmlns:w="http://schemas.openxmlformats.org/wordprocessingml/2006/main" xmlns:w14="http://schemas.microsoft.com/office/word/2010/wordml" xmlns:w15="http://schemas.microsoft.com/office/word/2012/wordml" xmlns:w16cex="http://schemas.microsoft.com/office/word/2018/wordml/cex" xmlns:w16cid="http://schemas.microsoft.com/office/word/2016/wordml/cid" xmlns:w16="http://schemas.microsoft.com/office/word/2018/wordml" xmlns:w16du="http://schemas.microsoft.com/office/word/2023/wordml/word16du" xmlns:w16sdtdh="http://schemas.microsoft.com/office/word/2020/wordml/sdtdatahash" xmlns:w16sdtfl="http://schemas.microsoft.com/office/word/2024/wordml/sdtformatlock" xmlns:w16se="http://schemas.microsoft.com/office/word/2015/wordml/symex" xmlns:wpg="http://schemas.microsoft.com/office/word/2010/wordprocessingGroup" xmlns:wpi="http://schemas.microsoft.com/office/word/2010/wordprocessingInk" xmlns:wne="http://schemas.microsoft.com/office/word/2006/wordml" xmlns:wps="http://schemas.microsoft.com/office/word/2010/wordprocessingShape" mc:Ignorable="w14 w15 w16se w16cid w16 w16cex w16sdtdh w16sdtfl w16du wp14">
-  <w15:person w15:author="Efraim Taranto">
-    <w15:presenceInfo w15:providerId="AD" w15:userId="S::ef@spaghettify.net::db016e50-a06c-470b-8706-fa2616718080"/>
-  </w15:person>
-</w15:people>
 </file>
 
 <file path=word/styles.xml><?xml version="1.0" encoding="utf-8"?>
@@ -8643,14 +8558,6 @@
       <w:keepLines/>
       <w:spacing w:before="160" w:after="80"/>
       <w:outlineLvl w:val="1"/>
-      <w:pPrChange w:id="0" w:author="Efraim Taranto" w:date="2026-08-25T10:17:00Z">
-        <w:pPr>
-          <w:keepNext/>
-          <w:keepLines/>
-          <w:spacing w:before="160" w:after="80" w:line="278" w:lineRule="auto"/>
-          <w:outlineLvl w:val="1"/>
-        </w:pPr>
-      </w:pPrChange>
     </w:pPr>
     <w:rPr>
       <w:rFonts w:asciiTheme="majorHAnsi" w:eastAsiaTheme="majorEastAsia" w:hAnsiTheme="majorHAnsi" w:cstheme="majorBidi"/>
@@ -8659,17 +8566,6 @@
       <w:color w:val="0F4761" w:themeColor="accent1" w:themeShade="BF"/>
       <w:sz w:val="32"/>
       <w:szCs w:val="32"/>
-      <w:rPrChange w:id="0" w:author="Efraim Taranto" w:date="2026-08-25T10:17:00Z">
-        <w:rPr>
-          <w:rFonts w:asciiTheme="majorHAnsi" w:eastAsiaTheme="majorEastAsia" w:hAnsiTheme="majorHAnsi" w:cstheme="majorBidi"/>
-          <w:color w:val="0F4761" w:themeColor="accent1" w:themeShade="BF"/>
-          <w:kern w:val="2"/>
-          <w:sz w:val="32"/>
-          <w:szCs w:val="32"/>
-          <w:lang w:val="en-AU" w:eastAsia="en-US" w:bidi="ar-SA"/>
-          <w14:ligatures w14:val="standardContextual"/>
-        </w:rPr>
-      </w:rPrChange>
     </w:rPr>
   </w:style>
   <w:style w:type="paragraph" w:styleId="Heading3">
@@ -8686,14 +8582,6 @@
       <w:keepLines/>
       <w:spacing w:before="160" w:after="80"/>
       <w:outlineLvl w:val="2"/>
-      <w:pPrChange w:id="1" w:author="Efraim Taranto" w:date="2026-08-25T10:17:00Z">
-        <w:pPr>
-          <w:keepNext/>
-          <w:keepLines/>
-          <w:spacing w:before="160" w:after="80" w:line="278" w:lineRule="auto"/>
-          <w:outlineLvl w:val="2"/>
-        </w:pPr>
-      </w:pPrChange>
     </w:pPr>
     <w:rPr>
       <w:rFonts w:eastAsiaTheme="majorEastAsia" w:cstheme="majorBidi"/>
@@ -8702,17 +8590,6 @@
       <w:color w:val="0F4761" w:themeColor="accent1" w:themeShade="BF"/>
       <w:sz w:val="28"/>
       <w:szCs w:val="28"/>
-      <w:rPrChange w:id="1" w:author="Efraim Taranto" w:date="2026-08-25T10:17:00Z">
-        <w:rPr>
-          <w:rFonts w:asciiTheme="minorHAnsi" w:eastAsiaTheme="majorEastAsia" w:hAnsiTheme="minorHAnsi" w:cstheme="majorBidi"/>
-          <w:color w:val="0F4761" w:themeColor="accent1" w:themeShade="BF"/>
-          <w:kern w:val="2"/>
-          <w:sz w:val="28"/>
-          <w:szCs w:val="28"/>
-          <w:lang w:val="en-AU" w:eastAsia="en-US" w:bidi="ar-SA"/>
-          <w14:ligatures w14:val="standardContextual"/>
-        </w:rPr>
-      </w:rPrChange>
     </w:rPr>
   </w:style>
   <w:style w:type="paragraph" w:styleId="Heading4">
@@ -8729,31 +8606,10 @@
       <w:keepLines/>
       <w:spacing w:before="80" w:after="40"/>
       <w:outlineLvl w:val="3"/>
-      <w:pPrChange w:id="2" w:author="Efraim Taranto" w:date="2026-08-25T10:17:00Z">
-        <w:pPr>
-          <w:keepNext/>
-          <w:keepLines/>
-          <w:spacing w:before="80" w:after="40" w:line="278" w:lineRule="auto"/>
-          <w:outlineLvl w:val="3"/>
-        </w:pPr>
-      </w:pPrChange>
     </w:pPr>
     <w:rPr>
       <w:rFonts w:eastAsiaTheme="majorEastAsia" w:cstheme="majorBidi"/>
       <w:color w:val="0F4761" w:themeColor="accent1" w:themeShade="BF"/>
-      <w:rPrChange w:id="2" w:author="Efraim Taranto" w:date="2026-08-25T10:17:00Z">
-        <w:rPr>
-          <w:rFonts w:asciiTheme="minorHAnsi" w:eastAsiaTheme="majorEastAsia" w:hAnsiTheme="minorHAnsi" w:cstheme="majorBidi"/>
-          <w:i/>
-          <w:iCs/>
-          <w:color w:val="0F4761" w:themeColor="accent1" w:themeShade="BF"/>
-          <w:kern w:val="2"/>
-          <w:sz w:val="24"/>
-          <w:szCs w:val="24"/>
-          <w:lang w:val="en-AU" w:eastAsia="en-US" w:bidi="ar-SA"/>
-          <w14:ligatures w14:val="standardContextual"/>
-        </w:rPr>
-      </w:rPrChange>
     </w:rPr>
   </w:style>
   <w:style w:type="paragraph" w:styleId="Heading5">

</xml_diff>